<commit_message>
fix(关键): msup/msub 的OMML顶层容器从 m:sup/m:sub 改为正确的 m:sSup/m:sSub（OOXML规范）
这是 (-2)^3 等上标无法正确渲染的根因：
- <m:sup> 在 OOML 中只是上标'内容元素'，不是函数容器
- Word 需要 <m:sSup>(<m:e>底数</m:e>, <m:sup>上标内容</m:sup>) 才能渲染为上标
- 同理 <m:sub> → <m:sSub>

之前修了3层（结构规整化、双层e嵌套、m:sz字号）都无效，
因为最外层容器名就错了，Word根本不认为它是上标结构。
</commit_message>
<xml_diff>
--- a/demo/试卷样例.docx
+++ b/demo/试卷样例.docx
@@ -264,7 +264,7 @@
         <m:r>
           <m:t xml:space="preserve">=</m:t>
         </m:r>
-        <m:sup>
+        <m:sSup>
           <m:e>
             <m:r>
               <m:t xml:space="preserve">90</m:t>
@@ -278,7 +278,7 @@
               <m:t xml:space="preserve">°</m:t>
             </m:r>
           </m:sup>
-        </m:sup>
+        </m:sSup>
       </m:oMath>
       <w:r>
         <w:rPr>
@@ -366,7 +366,7 @@
         <w:t xml:space="preserve">   A. </w:t>
       </w:r>
       <m:oMath>
-        <m:sup>
+        <m:sSup>
           <m:e>
             <m:r>
               <m:t xml:space="preserve">30</m:t>
@@ -380,7 +380,7 @@
               <m:t xml:space="preserve">°</m:t>
             </m:r>
           </m:sup>
-        </m:sup>
+        </m:sSup>
       </m:oMath>
       <w:r>
         <w:rPr>
@@ -389,7 +389,7 @@
         <w:t xml:space="preserve">　B. </w:t>
       </w:r>
       <m:oMath>
-        <m:sup>
+        <m:sSup>
           <m:e>
             <m:r>
               <m:t xml:space="preserve">40</m:t>
@@ -403,7 +403,7 @@
               <m:t xml:space="preserve">°</m:t>
             </m:r>
           </m:sup>
-        </m:sup>
+        </m:sSup>
       </m:oMath>
       <w:r>
         <w:rPr>
@@ -412,7 +412,7 @@
         <w:t xml:space="preserve">　C. </w:t>
       </w:r>
       <m:oMath>
-        <m:sup>
+        <m:sSup>
           <m:e>
             <m:r>
               <m:t xml:space="preserve">50</m:t>
@@ -426,7 +426,7 @@
               <m:t xml:space="preserve">°</m:t>
             </m:r>
           </m:sup>
-        </m:sup>
+        </m:sSup>
       </m:oMath>
       <w:r>
         <w:rPr>
@@ -435,7 +435,7 @@
         <w:t xml:space="preserve">　D. </w:t>
       </w:r>
       <m:oMath>
-        <m:sup>
+        <m:sSup>
           <m:e>
             <m:r>
               <m:t xml:space="preserve">60</m:t>
@@ -449,7 +449,7 @@
               <m:t xml:space="preserve">°</m:t>
             </m:r>
           </m:sup>
-        </m:sup>
+        </m:sSup>
       </m:oMath>
     </w:p>
     <w:p>
@@ -463,7 +463,7 @@
         <w:t xml:space="preserve">计算 </w:t>
       </w:r>
       <m:oMath>
-        <m:sup>
+        <m:sSup>
           <m:e>
             <m:r>
               <m:t xml:space="preserve">(</m:t>
@@ -486,7 +486,7 @@
               <m:t xml:space="preserve">3</m:t>
             </m:r>
           </m:sup>
-        </m:sup>
+        </m:sSup>
       </m:oMath>
       <w:r>
         <w:rPr>
@@ -777,7 +777,7 @@
         <w:t>1.（8 分）计算：</w:t>
       </w:r>
       <m:oMath>
-        <m:sup>
+        <m:sSup>
           <m:e>
             <m:r>
               <m:t xml:space="preserve">2</m:t>
@@ -791,7 +791,7 @@
               <m:t xml:space="preserve">3</m:t>
             </m:r>
           </m:sup>
-        </m:sup>
+        </m:sSup>
         <m:r>
           <m:t xml:space="preserve">×</m:t>
         </m:r>
@@ -1165,7 +1165,7 @@
         <m:r>
           <m:t xml:space="preserve">=</m:t>
         </m:r>
-        <m:sup>
+        <m:sSup>
           <m:e>
             <m:r>
               <m:t xml:space="preserve">90</m:t>
@@ -1179,7 +1179,7 @@
               <m:t xml:space="preserve">°</m:t>
             </m:r>
           </m:sup>
-        </m:sup>
+        </m:sSup>
       </m:oMath>
       <w:r>
         <w:rPr>
@@ -1290,7 +1290,7 @@
                   </m:rPr>
                   <m:t xml:space="preserve">A</m:t>
                 </m:r>
-                <m:sup>
+                <m:sSup>
                   <m:e>
                     <m:r>
                       <m:rPr>
@@ -1307,7 +1307,7 @@
                       <m:t xml:space="preserve">2</m:t>
                     </m:r>
                   </m:sup>
-                </m:sup>
+                </m:sSup>
                 <m:r>
                   <m:t xml:space="preserve">+</m:t>
                 </m:r>
@@ -1317,7 +1317,7 @@
                   </m:rPr>
                   <m:t xml:space="preserve">B</m:t>
                 </m:r>
-                <m:sup>
+                <m:sSup>
                   <m:e>
                     <m:r>
                       <m:rPr>
@@ -1334,7 +1334,7 @@
                       <m:t xml:space="preserve">2</m:t>
                     </m:r>
                   </m:sup>
-                </m:sup>
+                </m:sSup>
               </m:e>
             </m:e>
           </m:rad>
@@ -1346,7 +1346,7 @@
             <m:deg/>
             <m:e>
               <m:e>
-                <m:sup>
+                <m:sSup>
                   <m:e>
                     <m:r>
                       <m:t xml:space="preserve">4</m:t>
@@ -1360,11 +1360,11 @@
                       <m:t xml:space="preserve">2</m:t>
                     </m:r>
                   </m:sup>
-                </m:sup>
+                </m:sSup>
                 <m:r>
                   <m:t xml:space="preserve">+</m:t>
                 </m:r>
-                <m:sup>
+                <m:sSup>
                   <m:e>
                     <m:r>
                       <m:t xml:space="preserve">3</m:t>
@@ -1378,7 +1378,7 @@
                       <m:t xml:space="preserve">2</m:t>
                     </m:r>
                   </m:sup>
-                </m:sup>
+                </m:sSup>
               </m:e>
             </m:e>
           </m:rad>

</xml_diff>